<commit_message>
Feito uma gama de alterações nos arquivos
</commit_message>
<xml_diff>
--- a/Atividade_avaliativa/Trabalho_Pokemon.docx
+++ b/Atividade_avaliativa/Trabalho_Pokemon.docx
@@ -347,7 +347,7 @@
       <w:r>
         <w:drawing>
           <wp:inline distT="0" distB="0" distL="0" distR="0">
-            <wp:extent cx="4381500" cy="6581775"/>
+            <wp:extent cx="3333750" cy="5962650"/>
             <wp:effectExtent t="0" r="0" b="0" l="0"/>
             <wp:docPr id="1" name="" descr="" title=""/>
             <wp:cNvGraphicFramePr>
@@ -372,7 +372,7 @@
                   <pic:spPr bwMode="auto">
                     <a:xfrm>
                       <a:off x="0" y="0"/>
-                      <a:ext cx="4381500" cy="6581775"/>
+                      <a:ext cx="3333750" cy="5962650"/>
                     </a:xfrm>
                     <a:prstGeom prst="rect">
                       <a:avLst/>
@@ -397,7 +397,7 @@
           <w:sz w:val="18"/>
           <w:szCs w:val="18"/>
         </w:rPr>
-        <w:t xml:space="preserve">Figura 1 – Diagrama de Casos de Uso do Sistema de Gerenciamento Pokémon</w:t>
+        <w:t xml:space="preserve">Figura 1 – Diagrama de Casos de Uso do Sistema de Gerenciamento Pokémon (estilo Astah)</w:t>
       </w:r>
     </w:p>
     <w:p>
@@ -431,7 +431,7 @@
       <w:r>
         <w:drawing>
           <wp:inline distT="0" distB="0" distL="0" distR="0">
-            <wp:extent cx="5905500" cy="4057650"/>
+            <wp:extent cx="5524500" cy="4410075"/>
             <wp:effectExtent t="0" r="0" b="0" l="0"/>
             <wp:docPr id="1" name="" descr="" title=""/>
             <wp:cNvGraphicFramePr>
@@ -456,7 +456,7 @@
                   <pic:spPr bwMode="auto">
                     <a:xfrm>
                       <a:off x="0" y="0"/>
-                      <a:ext cx="5905500" cy="4057650"/>
+                      <a:ext cx="5524500" cy="4410075"/>
                     </a:xfrm>
                     <a:prstGeom prst="rect">
                       <a:avLst/>
@@ -481,7 +481,7 @@
           <w:sz w:val="18"/>
           <w:szCs w:val="18"/>
         </w:rPr>
-        <w:t xml:space="preserve">Figura 2 – Diagrama de Classes do Modelo e da Persistência</w:t>
+        <w:t xml:space="preserve">Figura 2 – Diagrama de Classes do Modelo e da Persistência (estilo Astah)</w:t>
       </w:r>
     </w:p>
     <w:p>
@@ -1422,7 +1422,7 @@
         <w:jc w:val="both"/>
       </w:pPr>
       <w:r>
-        <w:t xml:space="preserve">O mesmo padrão de teste (salvar e ler do arquivo) foi aplicado às classes Tipo, Habitat, Regiao, Pokemon e Captura. Também foram implementados testes para as regras de negócio de captura/libertação e para a operação de associação de vincular um Pokémon a um novo tipo, validando que a quantidade disponível do Pokémon é corretamente decrementada e restaurada. A execução de "python3 -m unittest tests.test_persistencia -v" resultou em 11 testes executados com sucesso (OK).</w:t>
+        <w:t xml:space="preserve">O mesmo padrão de teste (salvar e ler do arquivo) foi aplicado às classes Tipo, Habitat, Regiao, Pokemon e Captura. Também foram implementados testes para as regras de negócio de captura/libertação, para a operação de associação de vincular um Pokémon a um novo tipo, e para o CRUD completo (atualizar e excluir) da entidade Captura, validando que a quantidade disponível do Pokémon é corretamente decrementada e restaurada. A execução de "python3 -m unittest tests.test_persistencia -v" resultou em 12 testes executados com sucesso (OK).</w:t>
       </w:r>
     </w:p>
     <w:p>
@@ -1491,8 +1491,186 @@
         <w:t xml:space="preserve">Login de exemplo (Treinador): ash@pokemanager.com / treinador123</w:t>
       </w:r>
     </w:p>
+    <w:p>
+      <w:pPr>
+        <w:sectPr>
+          <w:pgSz w:w="12240" w:h="15840" w:orient="portrait"/>
+          <w:pgMar w:top="1134" w:right="1134" w:bottom="1134" w:left="1134" w:header="708" w:footer="708" w:gutter="0"/>
+          <w:pgNumType/>
+          <w:docGrid w:linePitch="360"/>
+        </w:sectPr>
+      </w:pPr>
+    </w:p>
+    <w:p>
+      <w:pPr>
+        <w:pStyle w:val="Heading1"/>
+        <w:spacing w:after="150" w:before="300"/>
+      </w:pPr>
+      <w:r>
+        <w:t xml:space="preserve">5. Diagrama de Classe da Interface com o Usuário</w:t>
+      </w:r>
+    </w:p>
+    <w:p>
+      <w:pPr>
+        <w:spacing w:after="150"/>
+        <w:jc w:val="both"/>
+      </w:pPr>
+      <w:r>
+        <w:t xml:space="preserve">Este diagrama representa as classes da camada View (template) do sistema — as telas/menus com as quais o usuário interage diretamente — contendo as operações previstas para cada perfil. TelaLogin autentica o usuário e, conforme o perfil retornado, direciona para MenuAdministrador ou MenuTreinador, cada uma expondo como métodos as opções de menu disponíveis para aquele perfil.</w:t>
+      </w:r>
+    </w:p>
+    <w:p>
+      <w:pPr>
+        <w:spacing w:after="80" w:before="150"/>
+        <w:jc w:val="center"/>
+      </w:pPr>
+      <w:r>
+        <w:drawing>
+          <wp:inline distT="0" distB="0" distL="0" distR="0">
+            <wp:extent cx="4381500" cy="2686050"/>
+            <wp:effectExtent t="0" r="0" b="0" l="0"/>
+            <wp:docPr id="1" name="" descr="" title=""/>
+            <wp:cNvGraphicFramePr>
+              <a:graphicFrameLocks xmlns:a="http://schemas.openxmlformats.org/drawingml/2006/main" noChangeAspect="1"/>
+            </wp:cNvGraphicFramePr>
+            <a:graphic xmlns:a="http://schemas.openxmlformats.org/drawingml/2006/main">
+              <a:graphicData uri="http://schemas.openxmlformats.org/drawingml/2006/picture">
+                <pic:pic xmlns:pic="http://schemas.openxmlformats.org/drawingml/2006/picture">
+                  <pic:nvPicPr>
+                    <pic:cNvPr id="0" name="" descr=""/>
+                    <pic:cNvPicPr>
+                      <a:picLocks noChangeAspect="1" noChangeArrowheads="1"/>
+                    </pic:cNvPicPr>
+                  </pic:nvPicPr>
+                  <pic:blipFill>
+                    <a:blip r:embed="rId9" cstate="none"/>
+                    <a:srcRect/>
+                    <a:stretch>
+                      <a:fillRect/>
+                    </a:stretch>
+                  </pic:blipFill>
+                  <pic:spPr bwMode="auto">
+                    <a:xfrm>
+                      <a:off x="0" y="0"/>
+                      <a:ext cx="4381500" cy="2686050"/>
+                    </a:xfrm>
+                    <a:prstGeom prst="rect">
+                      <a:avLst/>
+                    </a:prstGeom>
+                  </pic:spPr>
+                </pic:pic>
+              </a:graphicData>
+            </a:graphic>
+          </wp:inline>
+        </w:drawing>
+      </w:r>
+    </w:p>
+    <w:p>
+      <w:pPr>
+        <w:spacing w:after="250"/>
+        <w:jc w:val="center"/>
+      </w:pPr>
+      <w:r>
+        <w:rPr>
+          <w:i/>
+          <w:iCs/>
+          <w:sz w:val="18"/>
+          <w:szCs w:val="18"/>
+        </w:rPr>
+        <w:t xml:space="preserve">Figura 3 – Diagrama de Classe da Interface com o Usuário (estilo Astah)</w:t>
+      </w:r>
+    </w:p>
+    <w:p>
+      <w:pPr>
+        <w:sectPr>
+          <w:pgSz w:w="12240" w:h="15840" w:orient="portrait"/>
+          <w:pgMar w:top="1134" w:right="1134" w:bottom="1134" w:left="1134" w:header="708" w:footer="708" w:gutter="0"/>
+          <w:pgNumType/>
+          <w:docGrid w:linePitch="360"/>
+        </w:sectPr>
+      </w:pPr>
+    </w:p>
+    <w:p>
+      <w:pPr>
+        <w:pStyle w:val="Heading1"/>
+        <w:spacing w:after="150" w:before="300"/>
+      </w:pPr>
+      <w:r>
+        <w:t xml:space="preserve">6. Diagrama de Classes de Operações (View/Service)</w:t>
+      </w:r>
+    </w:p>
+    <w:p>
+      <w:pPr>
+        <w:spacing w:after="150"/>
+        <w:jc w:val="both"/>
+      </w:pPr>
+      <w:r>
+        <w:t xml:space="preserve">Este diagrama detalha a camada Service (operações do sistema), com todos os métodos e parâmetros necessários para cada operação, e as dependências («usa») entre as classes de interface (View) e as classes de serviço que elas acionam. Cada classe Service concentra as regras de negócio de uma entidade e delega a persistência ao respectivo repositório (camada persistence, já detalhada na Figura 2).</w:t>
+      </w:r>
+    </w:p>
+    <w:p>
+      <w:pPr>
+        <w:spacing w:after="80" w:before="150"/>
+        <w:jc w:val="center"/>
+      </w:pPr>
+      <w:r>
+        <w:drawing>
+          <wp:inline distT="0" distB="0" distL="0" distR="0">
+            <wp:extent cx="6286500" cy="3724275"/>
+            <wp:effectExtent t="0" r="0" b="0" l="0"/>
+            <wp:docPr id="1" name="" descr="" title=""/>
+            <wp:cNvGraphicFramePr>
+              <a:graphicFrameLocks xmlns:a="http://schemas.openxmlformats.org/drawingml/2006/main" noChangeAspect="1"/>
+            </wp:cNvGraphicFramePr>
+            <a:graphic xmlns:a="http://schemas.openxmlformats.org/drawingml/2006/main">
+              <a:graphicData uri="http://schemas.openxmlformats.org/drawingml/2006/picture">
+                <pic:pic xmlns:pic="http://schemas.openxmlformats.org/drawingml/2006/picture">
+                  <pic:nvPicPr>
+                    <pic:cNvPr id="0" name="" descr=""/>
+                    <pic:cNvPicPr>
+                      <a:picLocks noChangeAspect="1" noChangeArrowheads="1"/>
+                    </pic:cNvPicPr>
+                  </pic:nvPicPr>
+                  <pic:blipFill>
+                    <a:blip r:embed="rId10" cstate="none"/>
+                    <a:srcRect/>
+                    <a:stretch>
+                      <a:fillRect/>
+                    </a:stretch>
+                  </pic:blipFill>
+                  <pic:spPr bwMode="auto">
+                    <a:xfrm>
+                      <a:off x="0" y="0"/>
+                      <a:ext cx="6286500" cy="3724275"/>
+                    </a:xfrm>
+                    <a:prstGeom prst="rect">
+                      <a:avLst/>
+                    </a:prstGeom>
+                  </pic:spPr>
+                </pic:pic>
+              </a:graphicData>
+            </a:graphic>
+          </wp:inline>
+        </w:drawing>
+      </w:r>
+    </w:p>
+    <w:p>
+      <w:pPr>
+        <w:spacing w:after="250"/>
+        <w:jc w:val="center"/>
+      </w:pPr>
+      <w:r>
+        <w:rPr>
+          <w:i/>
+          <w:iCs/>
+          <w:sz w:val="18"/>
+          <w:szCs w:val="18"/>
+        </w:rPr>
+        <w:t xml:space="preserve">Figura 4 – Diagrama de Classes de Operações View/Service (estilo Astah)</w:t>
+      </w:r>
+    </w:p>
     <w:sectPr>
-      <w:pgSz w:w="12240" w:h="15840" w:orient="portrait"/>
+      <w:pgSz w:w="15840" w:h="12240" w:orient="portrait"/>
       <w:pgMar w:top="1134" w:right="1134" w:bottom="1134" w:left="1134" w:header="708" w:footer="708" w:gutter="0"/>
       <w:pgNumType/>
       <w:docGrid w:linePitch="360"/>

</xml_diff>